<commit_message>
docs: real repo URL + single self-contained Kaggle dataset in both guides
</commit_message>
<xml_diff>
--- a/docs/INSTRUCTIONS_ABRAR.docx
+++ b/docs/INSTRUCTIONS_ABRAR.docx
@@ -145,15 +145,16 @@
         <w:t>+ Add Data</w:t>
       </w:r>
       <w:r>
-        <w:t xml:space="preserve"> → attach BOTH datasets:</w:t>
+        <w:t xml:space="preserve"> → attach the </w:t>
       </w:r>
-    </w:p>
-    <w:p>
-      <w:pPr>
-        <w:pStyle w:val="ListBullet"/>
-      </w:pPr>
       <w:r>
-        <w:t xml:space="preserve">the EDA-outputs dataset (contains </w:t>
+        <w:rPr>
+          <w:b/>
+        </w:rPr>
+        <w:t>PCMMD dataset</w:t>
+      </w:r>
+      <w:r>
+        <w:t xml:space="preserve"> (uploaded from </w:t>
       </w:r>
       <w:r>
         <w:rPr>
@@ -161,10 +162,15 @@
           <w:color w:val="C7254E"/>
           <w:sz w:val="19"/>
         </w:rPr>
-        <w:t>pcmmd_eda_outputs/fold_1.csv … fold_5.csv</w:t>
+        <w:t>PCMMD_kaggle_dataset.zip</w:t>
       </w:r>
       <w:r>
-        <w:t xml:space="preserve">, </w:t>
+        <w:t>).</w:t>
+      </w:r>
+    </w:p>
+    <w:p>
+      <w:r>
+        <w:t xml:space="preserve">   It is self-contained: </w:t>
       </w:r>
       <w:r>
         <w:rPr>
@@ -172,18 +178,32 @@
           <w:color w:val="C7254E"/>
           <w:sz w:val="19"/>
         </w:rPr>
-        <w:t>fewshot_*.csv</w:t>
+        <w:t>pcmmd_eda_outputs/</w:t>
       </w:r>
       <w:r>
-        <w:t>)</w:t>
+        <w:t xml:space="preserve"> (folds + few-shot + metadata) </w:t>
+      </w:r>
+      <w:r>
+        <w:rPr>
+          <w:b/>
+        </w:rPr>
+        <w:t>and</w:t>
       </w:r>
     </w:p>
     <w:p>
-      <w:pPr>
-        <w:pStyle w:val="ListBullet"/>
-      </w:pPr>
       <w:r>
-        <w:t>the raw-image dataset (the cropped cell PNGs)</w:t>
+        <w:t xml:space="preserve">   </w:t>
+      </w:r>
+      <w:r>
+        <w:rPr>
+          <w:rFonts w:ascii="Consolas" w:hAnsi="Consolas"/>
+          <w:color w:val="C7254E"/>
+          <w:sz w:val="19"/>
+        </w:rPr>
+        <w:t>patient_cells/</w:t>
+      </w:r>
+      <w:r>
+        <w:t xml:space="preserve"> (the cropped cell images). One dataset is enough.</w:t>
       </w:r>
     </w:p>
     <w:p>
@@ -211,7 +231,7 @@
           <w:rFonts w:ascii="Consolas" w:hAnsi="Consolas"/>
           <w:sz w:val="19"/>
         </w:rPr>
-        <w:t xml:space="preserve">   !git clone &lt;YOUR_REPO_URL&gt; /kaggle/working/PCMMD-repo</w:t>
+        <w:t xml:space="preserve">   !git clone https://github.com/TanvirLimon12/PCMMD-FL-TL-KD /kaggle/working/PCMMD-repo</w:t>
       </w:r>
     </w:p>
     <w:p>
@@ -240,6 +260,61 @@
           <w:sz w:val="19"/>
         </w:rPr>
         <w:t xml:space="preserve">   !pip install -q -r requirements.txt</w:t>
+      </w:r>
+    </w:p>
+    <w:p>
+      <w:pPr>
+        <w:shd w:val="clear" w:fill="EAF2FB"/>
+      </w:pPr>
+      <w:r>
+        <w:t xml:space="preserve">The folds/few-shot CSVs are also bundled in the repo at </w:t>
+      </w:r>
+      <w:r>
+        <w:rPr>
+          <w:rFonts w:ascii="Consolas" w:hAnsi="Consolas"/>
+          <w:color w:val="C7254E"/>
+          <w:sz w:val="19"/>
+        </w:rPr>
+        <w:t>data/eda/</w:t>
+      </w:r>
+      <w:r>
+        <w:t xml:space="preserve"> (so local runs work</w:t>
+      </w:r>
+    </w:p>
+    <w:p>
+      <w:pPr>
+        <w:shd w:val="clear" w:fill="EAF2FB"/>
+      </w:pPr>
+      <w:r>
+        <w:t xml:space="preserve">with no setup). On Kaggle you still attach the dataset above for the </w:t>
+      </w:r>
+      <w:r>
+        <w:rPr>
+          <w:b/>
+        </w:rPr>
+        <w:t>images</w:t>
+      </w:r>
+      <w:r>
+        <w:t>, then run</w:t>
+      </w:r>
+    </w:p>
+    <w:p>
+      <w:pPr>
+        <w:shd w:val="clear" w:fill="EAF2FB"/>
+      </w:pPr>
+      <w:r>
+        <w:t xml:space="preserve">the patch cell below to point </w:t>
+      </w:r>
+      <w:r>
+        <w:rPr>
+          <w:rFonts w:ascii="Consolas" w:hAnsi="Consolas"/>
+          <w:color w:val="C7254E"/>
+          <w:sz w:val="19"/>
+        </w:rPr>
+        <w:t>image_root</w:t>
+      </w:r>
+      <w:r>
+        <w:t xml:space="preserve"> at the mounted images.</w:t>
       </w:r>
     </w:p>
     <w:p>
@@ -328,7 +403,7 @@
           <w:rFonts w:ascii="Consolas" w:hAnsi="Consolas"/>
           <w:sz w:val="19"/>
         </w:rPr>
-        <w:t xml:space="preserve">   assert fold_hits, "fold_1.csv not found — did you attach the EDA-outputs dataset?"</w:t>
+        <w:t xml:space="preserve">   assert fold_hits, "fold_1.csv not found — did you attach the PCMMD dataset?"</w:t>
       </w:r>
     </w:p>
     <w:p>

</xml_diff>